<commit_message>
fix(outils): un .docx ouvert dans Word ne bloque plus les autres
Windows verrouille un .docx tant qu'il est ouvert, et l'ecriture leve EBUSY.
Le script s'arretait la : un seul fichier ouvert, et les documents suivants
restaient a l'ancienne version sans que rien ne le dise.

C'est le pire des cas — on repart avec un lot a moitie a jour en croyant
l'avoir regenere. C'est arrive aujourd'hui sur les CGV : trois documents
portaient la nouvelle adresse de contact, un non.

Le script continue desormais et recapitule a la fin ce qu'il n'a pas pu
ecrire, en nommant les fichiers a fermer. Code de sortie 1 pour qu'un
enchainement s'arrete.

Co-Authored-By: Claude Opus 5 <noreply@anthropic.com>
</commit_message>
<xml_diff>
--- a/GUIDE_DEVELOPPEMENT/documents-legaux/MENTIONS_LEGALES.docx
+++ b/GUIDE_DEVELOPPEMENT/documents-legaux/MENTIONS_LEGALES.docx
@@ -127,7 +127,7 @@
           <w:sz w:val="22"/>
           <w:szCs w:val="22"/>
         </w:rPr>
-        <w:t xml:space="preserve">E-mail : reminotta@breakeatapp.com — Téléphone : 06 46 69 56 75.</w:t>
+        <w:t xml:space="preserve">E-mail : contact@breakeatapp.com — Téléphone : 06 46 69 56 75.</w:t>
       </w:r>
     </w:p>
     <w:p>
@@ -519,7 +519,7 @@
           <w:sz w:val="22"/>
           <w:szCs w:val="22"/>
         </w:rPr>
-        <w:t xml:space="preserve">Pour toute question relative aux données personnelles : reminotta@breakeatapp.com.</w:t>
+        <w:t xml:space="preserve">Pour toute question relative aux données personnelles : contact@breakeatapp.com.</w:t>
       </w:r>
     </w:p>
     <w:p>
@@ -621,7 +621,7 @@
           <w:sz w:val="22"/>
           <w:szCs w:val="22"/>
         </w:rPr>
-        <w:t xml:space="preserve">E-mail : reminotta@breakeatapp.com</w:t>
+        <w:t xml:space="preserve">E-mail : contact@breakeatapp.com</w:t>
       </w:r>
     </w:p>
     <w:p>

</xml_diff>